<commit_message>
Supabase-project gekoppeld via .env en handleiding bijgewerkt
De Project URL en publishable key staan in .env, zodat ze lokaal en bij EAS-builds
worden meegenomen. In de handleiding vervallen de stappen voor sleutels; de
nummering begint nu per stap opnieuw.

Co-Authored-By: Claude Opus 5.5 <noreply@anthropic.com>
Claude-Session: https://claude.ai/code/session_01HjRRzCr5tSTY2qwELU3w2K
</commit_message>
<xml_diff>
--- a/docs/Handleiding_Supabase_koppeling.docx
+++ b/docs/Handleiding_Supabase_koppeling.docx
@@ -73,33 +73,45 @@
     </w:p>
     <w:p>
       <w:pPr>
-        <w:pStyle w:val="ListNumber"/>
+        <w:spacing w:after="57"/>
+        <w:ind w:left="510" w:hanging="340"/>
       </w:pPr>
       <w:r>
+        <w:t>1.</w:t>
+        <w:tab/>
         <w:t>Open het project in supabase.com/dashboard.</w:t>
       </w:r>
     </w:p>
     <w:p>
       <w:pPr>
-        <w:pStyle w:val="ListNumber"/>
+        <w:spacing w:after="57"/>
+        <w:ind w:left="510" w:hanging="340"/>
       </w:pPr>
       <w:r>
+        <w:t>2.</w:t>
+        <w:tab/>
         <w:t>Ga naar SQL Editor → New query.</w:t>
       </w:r>
     </w:p>
     <w:p>
       <w:pPr>
-        <w:pStyle w:val="ListNumber"/>
+        <w:spacing w:after="57"/>
+        <w:ind w:left="510" w:hanging="340"/>
       </w:pPr>
       <w:r>
+        <w:t>3.</w:t>
+        <w:tab/>
         <w:t>Open in de code het bestand supabase/migrations/20261019000000_kabelcontrole.sql, kopieer de volledige inhoud en plak die in de editor.</w:t>
       </w:r>
     </w:p>
     <w:p>
       <w:pPr>
-        <w:pStyle w:val="ListNumber"/>
+        <w:spacing w:after="57"/>
+        <w:ind w:left="510" w:hanging="340"/>
       </w:pPr>
       <w:r>
+        <w:t>4.</w:t>
+        <w:tab/>
         <w:t>Klik op Run. Er verschijnt "Success. No rows returned". Het script mag gerust nog een keer uitgevoerd worden.</w:t>
       </w:r>
     </w:p>
@@ -139,25 +151,34 @@
     </w:p>
     <w:p>
       <w:pPr>
-        <w:pStyle w:val="ListNumber"/>
+        <w:spacing w:after="57"/>
+        <w:ind w:left="510" w:hanging="340"/>
       </w:pPr>
       <w:r>
+        <w:t>1.</w:t>
+        <w:tab/>
         <w:t>Authentication → Users → Add user → Create new user.</w:t>
       </w:r>
     </w:p>
     <w:p>
       <w:pPr>
-        <w:pStyle w:val="ListNumber"/>
+        <w:spacing w:after="57"/>
+        <w:ind w:left="510" w:hanging="340"/>
       </w:pPr>
       <w:r>
+        <w:t>2.</w:t>
+        <w:tab/>
         <w:t>Vul e-mailadres en een tijdelijk wachtwoord in en zet "Auto Confirm User" aan.</w:t>
       </w:r>
     </w:p>
     <w:p>
       <w:pPr>
-        <w:pStyle w:val="ListNumber"/>
+        <w:spacing w:after="57"/>
+        <w:ind w:left="510" w:hanging="340"/>
       </w:pPr>
       <w:r>
+        <w:t>3.</w:t>
+        <w:tab/>
         <w:t>Geef het wachtwoord persoonlijk door aan de gebruiker. Herhaal dit voor iedere medewerker.</w:t>
       </w:r>
     </w:p>
@@ -166,45 +187,13 @@
         <w:pStyle w:val="Heading1"/>
       </w:pPr>
       <w:r>
-        <w:t>Stap 4 – Sleutels in de app zetten</w:t>
+        <w:t>Stap 4 – Sleutels in de app (al geregeld)</w:t>
       </w:r>
     </w:p>
     <w:p>
-      <w:pPr>
-        <w:pStyle w:val="ListNumber"/>
-      </w:pPr>
+      <w:pPr/>
       <w:r>
-        <w:t>Ga in Supabase naar Project Settings → API (of de knop Connect).</w:t>
-      </w:r>
-    </w:p>
-    <w:p>
-      <w:pPr>
-        <w:pStyle w:val="ListNumber"/>
-      </w:pPr>
-      <w:r>
-        <w:t>Noteer de Project URL en de publishable key (begint met sb_publishable_) of de anon key.</w:t>
-      </w:r>
-    </w:p>
-    <w:p>
-      <w:pPr>
-        <w:pStyle w:val="ListNumber"/>
-      </w:pPr>
-      <w:r>
-        <w:t>Kopieer in de projectmap het bestand .env.example naar .env.local en vul beide waarden in.</w:t>
-      </w:r>
-    </w:p>
-    <w:p>
-      <w:r>
-        <w:rPr>
-          <w:b/>
-          <w:color w:val="B42318"/>
-        </w:rPr>
-        <w:t>Let op: gebruik nooit de secret key of service_role key in de app. Die omzeilt alle beveiliging en kan uit de app gehaald worden.</w:t>
-      </w:r>
-    </w:p>
-    <w:p>
-      <w:r>
-        <w:t>Het bestand .env.local komt niet in git en blijft dus op je eigen computer.</w:t>
+        <w:t>De Project URL en de publishable key van het Supabase-project znfrrmrsbylekavbfviq staan al in het bestand .env in het project. Ze gaan ook automatisch mee bij EAS-builds. Hiervoor hoef je niets te doen.</w:t>
       </w:r>
     </w:p>
     <w:p>
@@ -212,91 +201,61 @@
         <w:pStyle w:val="Heading1"/>
       </w:pPr>
       <w:r>
-        <w:t>Stap 5 – Sleutels in EAS zetten (voor builds)</w:t>
-      </w:r>
-    </w:p>
-    <w:p>
-      <w:r>
-        <w:t>Bij een build via EAS gaat .env.local niet mee. Zet de twee waarden daarom ook in EAS:</w:t>
+        <w:t>Stap 5 – Testen</w:t>
       </w:r>
     </w:p>
     <w:p>
       <w:pPr>
-        <w:pStyle w:val="ListNumber"/>
+        <w:spacing w:after="57"/>
+        <w:ind w:left="510" w:hanging="340"/>
       </w:pPr>
       <w:r>
-        <w:t>expo.dev → het project Kabelcontrole 20 kV → Environment variables → Add variable.</w:t>
-      </w:r>
-    </w:p>
-    <w:p>
-      <w:pPr>
-        <w:pStyle w:val="ListNumber"/>
-      </w:pPr>
-      <w:r>
-        <w:t>Naam EXPO_PUBLIC_SUPABASE_URL met de Project URL, en naam EXPO_PUBLIC_SUPABASE_KEY met de publishable key.</w:t>
-      </w:r>
-    </w:p>
-    <w:p>
-      <w:pPr>
-        <w:pStyle w:val="ListNumber"/>
-      </w:pPr>
-      <w:r>
-        <w:t>Kies alle omgevingen (development, preview, production) en zichtbaarheid Plain text.</w:t>
-      </w:r>
-    </w:p>
-    <w:p>
-      <w:pPr>
-        <w:pStyle w:val="ListNumber"/>
-      </w:pPr>
-      <w:r>
-        <w:t>Maak daarna een nieuwe build.</w:t>
-      </w:r>
-    </w:p>
-    <w:p>
-      <w:pPr>
-        <w:pStyle w:val="Heading1"/>
-      </w:pPr>
-      <w:r>
-        <w:t>Stap 6 – Testen</w:t>
-      </w:r>
-    </w:p>
-    <w:p>
-      <w:pPr>
-        <w:pStyle w:val="ListNumber"/>
-      </w:pPr>
-      <w:r>
+        <w:t>1.</w:t>
+        <w:tab/>
         <w:t>Start de app opnieuw (npx expo start). Env-variabelen worden alleen bij het starten ingelezen.</w:t>
       </w:r>
     </w:p>
     <w:p>
       <w:pPr>
-        <w:pStyle w:val="ListNumber"/>
+        <w:spacing w:after="57"/>
+        <w:ind w:left="510" w:hanging="340"/>
       </w:pPr>
       <w:r>
+        <w:t>2.</w:t>
+        <w:tab/>
         <w:t>De app vraagt om in te loggen. Log in met een account uit stap 3.</w:t>
       </w:r>
     </w:p>
     <w:p>
       <w:pPr>
-        <w:pStyle w:val="ListNumber"/>
+        <w:spacing w:after="57"/>
+        <w:ind w:left="510" w:hanging="340"/>
       </w:pPr>
       <w:r>
+        <w:t>3.</w:t>
+        <w:tab/>
         <w:t>Het startscherm toont de synchronisatiestatus, bijvoorbeeld "Gesynchroniseerd om 14:02".</w:t>
       </w:r>
     </w:p>
     <w:p>
       <w:pPr>
-        <w:pStyle w:val="ListNumber"/>
+        <w:spacing w:after="57"/>
+        <w:ind w:left="510" w:hanging="340"/>
       </w:pPr>
       <w:r>
+        <w:t>4.</w:t>
+        <w:tab/>
         <w:t>Gegevens die al op het toestel stonden worden bij de eerste synchronisatie geüpload. Controleer dit in Supabase onder Table Editor.</w:t>
       </w:r>
     </w:p>
     <w:p>
       <w:pPr>
-        <w:pStyle w:val="ListNumber"/>
+        <w:spacing w:after="57"/>
+        <w:ind w:left="510" w:hanging="340"/>
       </w:pPr>
       <w:r>
+        <w:t>5.</w:t>
+        <w:tab/>
         <w:t>Log op een tweede toestel in met een ander account: binnen enkele minuten verschijnen dezelfde projecten en foto’s.</w:t>
       </w:r>
     </w:p>

</xml_diff>